<commit_message>
fix: endDate template correction
</commit_message>
<xml_diff>
--- a/templates/sell_standard.docx
+++ b/templates/sell_standard.docx
@@ -409,15 +409,7 @@
           <w:sz w:val="20"/>
           <w:szCs w:val="20"/>
         </w:rPr>
-        <w:t/>
-      </w:r>
-      <w:r>
-        <w:rPr>
-          <w:rFonts w:ascii="Times New Roman" w:hAnsi="Times New Roman" w:cs="Times New Roman"/>
-          <w:sz w:val="20"/>
-          <w:szCs w:val="20"/>
-        </w:rPr>
-        <w:t xml:space="preserve" w:space="preserve"> </w:t>
+        <w:t xml:space="preserve"> </w:t>
       </w:r>
       <w:r>
         <w:rPr>
@@ -479,25 +471,16 @@
           <w:szCs w:val="20"/>
           <w:lang w:val="mn-MN"/>
         </w:rPr>
-        <w:t xml:space="preserve" w:space="preserve"> {{contractNumber}}</w:t>
-      </w:r>
-      <w:r>
-        <w:rPr>
-          <w:rFonts w:ascii="Times New Roman" w:hAnsi="Times New Roman" w:cs="Times New Roman"/>
-          <w:sz w:val="20"/>
-          <w:szCs w:val="20"/>
-          <w:lang w:val="mn-MN"/>
-        </w:rPr>
-        <w:t/>
-      </w:r>
-      <w:r>
-        <w:rPr>
-          <w:rFonts w:ascii="Times New Roman" w:hAnsi="Times New Roman" w:cs="Times New Roman"/>
-          <w:sz w:val="20"/>
-          <w:szCs w:val="20"/>
-          <w:lang w:val="mn-MN"/>
-        </w:rPr>
-        <w:t xml:space="preserve" w:space="preserve"> </w:t>
+        <w:t xml:space="preserve"> {{contractNumber}}</w:t>
+      </w:r>
+      <w:r>
+        <w:rPr>
+          <w:rFonts w:ascii="Times New Roman" w:hAnsi="Times New Roman" w:cs="Times New Roman"/>
+          <w:sz w:val="20"/>
+          <w:szCs w:val="20"/>
+          <w:lang w:val="mn-MN"/>
+        </w:rPr>
+        <w:t xml:space="preserve"> </w:t>
       </w:r>
       <w:r>
         <w:rPr>
@@ -796,151 +779,7 @@
                 <w:sz w:val="20"/>
                 <w:szCs w:val="20"/>
               </w:rPr>
-              <w:t>Хуулийн</w:t>
-            </w:r>
-            <w:r>
-              <w:rPr>
-                <w:rFonts w:ascii="Times New Roman" w:hAnsi="Times New Roman" w:cs="Times New Roman"/>
-                <w:sz w:val="20"/>
-                <w:szCs w:val="20"/>
-              </w:rPr>
-              <w:t xml:space="preserve"> </w:t>
-            </w:r>
-            <w:r>
-              <w:rPr>
-                <w:rFonts w:ascii="Times New Roman" w:hAnsi="Times New Roman" w:cs="Times New Roman"/>
-                <w:sz w:val="20"/>
-                <w:szCs w:val="20"/>
-              </w:rPr>
-              <w:t>этгээдийн</w:t>
-            </w:r>
-            <w:r>
-              <w:rPr>
-                <w:rFonts w:ascii="Times New Roman" w:hAnsi="Times New Roman" w:cs="Times New Roman"/>
-                <w:sz w:val="20"/>
-                <w:szCs w:val="20"/>
-              </w:rPr>
-              <w:t xml:space="preserve"> </w:t>
-            </w:r>
-            <w:r>
-              <w:rPr>
-                <w:rFonts w:ascii="Times New Roman" w:hAnsi="Times New Roman" w:cs="Times New Roman"/>
-                <w:sz w:val="20"/>
-                <w:szCs w:val="20"/>
-              </w:rPr>
-              <w:t>нэр</w:t>
-            </w:r>
-            <w:r>
-              <w:rPr>
-                <w:rFonts w:ascii="Times New Roman" w:hAnsi="Times New Roman" w:cs="Times New Roman"/>
-                <w:sz w:val="20"/>
-                <w:szCs w:val="20"/>
-              </w:rPr>
-              <w:t>…………………</w:t>
-            </w:r>
-            <w:r>
-              <w:rPr>
-                <w:rFonts w:ascii="Times New Roman" w:hAnsi="Times New Roman" w:cs="Times New Roman"/>
-                <w:sz w:val="20"/>
-                <w:szCs w:val="20"/>
-              </w:rPr>
-              <w:t>…..</w:t>
-            </w:r>
-            <w:r>
-              <w:rPr>
-                <w:rFonts w:ascii="Times New Roman" w:hAnsi="Times New Roman" w:cs="Times New Roman"/>
-                <w:sz w:val="20"/>
-                <w:szCs w:val="20"/>
-              </w:rPr>
-              <w:t>түүнийг</w:t>
-            </w:r>
-            <w:r>
-              <w:rPr>
-                <w:rFonts w:ascii="Times New Roman" w:hAnsi="Times New Roman" w:cs="Times New Roman"/>
-                <w:sz w:val="20"/>
-                <w:szCs w:val="20"/>
-              </w:rPr>
-              <w:t xml:space="preserve"> </w:t>
-            </w:r>
-            <w:r>
-              <w:rPr>
-                <w:rFonts w:ascii="Times New Roman" w:hAnsi="Times New Roman" w:cs="Times New Roman"/>
-                <w:sz w:val="20"/>
-                <w:szCs w:val="20"/>
-              </w:rPr>
-              <w:t>төлөөлөн</w:t>
-            </w:r>
-            <w:r>
-              <w:rPr>
-                <w:rFonts w:ascii="Times New Roman" w:hAnsi="Times New Roman" w:cs="Times New Roman"/>
-                <w:sz w:val="20"/>
-                <w:szCs w:val="20"/>
-              </w:rPr>
-              <w:t xml:space="preserve"> </w:t>
-            </w:r>
-            <w:r>
-              <w:rPr>
-                <w:rFonts w:ascii="Times New Roman" w:hAnsi="Times New Roman" w:cs="Times New Roman"/>
-                <w:sz w:val="20"/>
-                <w:szCs w:val="20"/>
-              </w:rPr>
-              <w:t>Захирал</w:t>
-            </w:r>
-            <w:r>
-              <w:rPr>
-                <w:rFonts w:ascii="Times New Roman" w:hAnsi="Times New Roman" w:cs="Times New Roman"/>
-                <w:sz w:val="20"/>
-                <w:szCs w:val="20"/>
-              </w:rPr>
-              <w:t>/</w:t>
-            </w:r>
-            <w:r>
-              <w:rPr>
-                <w:rFonts w:ascii="Times New Roman" w:hAnsi="Times New Roman" w:cs="Times New Roman"/>
-                <w:sz w:val="20"/>
-                <w:szCs w:val="20"/>
-              </w:rPr>
-              <w:t>Гүйцэтгэх</w:t>
-            </w:r>
-            <w:r>
-              <w:rPr>
-                <w:rFonts w:ascii="Times New Roman" w:hAnsi="Times New Roman" w:cs="Times New Roman"/>
-                <w:sz w:val="20"/>
-                <w:szCs w:val="20"/>
-              </w:rPr>
-              <w:t xml:space="preserve"> </w:t>
-            </w:r>
-            <w:r>
-              <w:rPr>
-                <w:rFonts w:ascii="Times New Roman" w:hAnsi="Times New Roman" w:cs="Times New Roman"/>
-                <w:sz w:val="20"/>
-                <w:szCs w:val="20"/>
-              </w:rPr>
-              <w:t>захирал</w:t>
-            </w:r>
-            <w:r>
-              <w:rPr>
-                <w:rFonts w:ascii="Times New Roman" w:hAnsi="Times New Roman" w:cs="Times New Roman"/>
-                <w:sz w:val="20"/>
-                <w:szCs w:val="20"/>
-              </w:rPr>
-              <w:t xml:space="preserve"> ............................</w:t>
-            </w:r>
-            <w:r>
-              <w:rPr>
-                <w:rFonts w:ascii="Times New Roman" w:hAnsi="Times New Roman" w:cs="Times New Roman"/>
-                <w:sz w:val="20"/>
-                <w:szCs w:val="20"/>
-              </w:rPr>
-              <w:t>овогтой</w:t>
-            </w:r>
-            <w:r>
-              <w:rPr>
-                <w:rFonts w:ascii="Times New Roman" w:hAnsi="Times New Roman" w:cs="Times New Roman"/>
-                <w:sz w:val="20"/>
-                <w:szCs w:val="20"/>
-              </w:rPr>
-              <w:t xml:space="preserve"> ............................. </w:t>
+              <w:t xml:space="preserve">Хуулийн этгээдийн нэр……………………..түүнийг төлөөлөн Захирал/Гүйцэтгэх захирал ............................овогтой ............................. </w:t>
             </w:r>
           </w:p>
           <w:p>
@@ -958,15 +797,7 @@
                 <w:sz w:val="20"/>
                 <w:szCs w:val="20"/>
               </w:rPr>
-              <w:t>Утас</w:t>
-            </w:r>
-            <w:r>
-              <w:rPr>
-                <w:rFonts w:ascii="Times New Roman" w:hAnsi="Times New Roman" w:cs="Times New Roman"/>
-                <w:sz w:val="20"/>
-                <w:szCs w:val="20"/>
-              </w:rPr>
-              <w:t xml:space="preserve">: ....................... </w:t>
+              <w:t xml:space="preserve">Утас: ....................... </w:t>
             </w:r>
           </w:p>
           <w:p>
@@ -984,23 +815,7 @@
                 <w:sz w:val="20"/>
                 <w:szCs w:val="20"/>
               </w:rPr>
-              <w:t>И-</w:t>
-            </w:r>
-            <w:r>
-              <w:rPr>
-                <w:rFonts w:ascii="Times New Roman" w:hAnsi="Times New Roman" w:cs="Times New Roman"/>
-                <w:sz w:val="20"/>
-                <w:szCs w:val="20"/>
-              </w:rPr>
-              <w:t>мэйл</w:t>
-            </w:r>
-            <w:r>
-              <w:rPr>
-                <w:rFonts w:ascii="Times New Roman" w:hAnsi="Times New Roman" w:cs="Times New Roman"/>
-                <w:sz w:val="20"/>
-                <w:szCs w:val="20"/>
-              </w:rPr>
-              <w:t>:.........................</w:t>
+              <w:t>И-мэйл:.........................</w:t>
             </w:r>
           </w:p>
         </w:tc>
@@ -1024,31 +839,7 @@
                 <w:sz w:val="20"/>
                 <w:szCs w:val="20"/>
               </w:rPr>
-              <w:t>Регистрийн</w:t>
-            </w:r>
-            <w:r>
-              <w:rPr>
-                <w:rFonts w:ascii="Times New Roman" w:hAnsi="Times New Roman" w:cs="Times New Roman"/>
-                <w:sz w:val="20"/>
-                <w:szCs w:val="20"/>
-              </w:rPr>
-              <w:t xml:space="preserve"> </w:t>
-            </w:r>
-            <w:r>
-              <w:rPr>
-                <w:rFonts w:ascii="Times New Roman" w:hAnsi="Times New Roman" w:cs="Times New Roman"/>
-                <w:sz w:val="20"/>
-                <w:szCs w:val="20"/>
-              </w:rPr>
-              <w:t>дугаар</w:t>
-            </w:r>
-            <w:r>
-              <w:rPr>
-                <w:rFonts w:ascii="Times New Roman" w:hAnsi="Times New Roman" w:cs="Times New Roman"/>
-                <w:sz w:val="20"/>
-                <w:szCs w:val="20"/>
-              </w:rPr>
-              <w:t>: 6764924</w:t>
+              <w:t>Регистрийн дугаар: 6764924</w:t>
             </w:r>
           </w:p>
           <w:p>
@@ -1068,55 +859,7 @@
                 <w:sz w:val="20"/>
                 <w:szCs w:val="20"/>
               </w:rPr>
-              <w:t>“</w:t>
-            </w:r>
-            <w:r>
-              <w:rPr>
-                <w:rFonts w:ascii="Times New Roman" w:hAnsi="Times New Roman" w:cs="Times New Roman"/>
-                <w:sz w:val="20"/>
-                <w:szCs w:val="20"/>
-              </w:rPr>
-              <w:t>Ап</w:t>
-            </w:r>
-            <w:r>
-              <w:rPr>
-                <w:rFonts w:ascii="Times New Roman" w:hAnsi="Times New Roman" w:cs="Times New Roman"/>
-                <w:sz w:val="20"/>
-                <w:szCs w:val="20"/>
-              </w:rPr>
-              <w:t xml:space="preserve"> </w:t>
-            </w:r>
-            <w:r>
-              <w:rPr>
-                <w:rFonts w:ascii="Times New Roman" w:hAnsi="Times New Roman" w:cs="Times New Roman"/>
-                <w:sz w:val="20"/>
-                <w:szCs w:val="20"/>
-              </w:rPr>
-              <w:t>проперти</w:t>
-            </w:r>
-            <w:r>
-              <w:rPr>
-                <w:rFonts w:ascii="Times New Roman" w:hAnsi="Times New Roman" w:cs="Times New Roman"/>
-                <w:sz w:val="20"/>
-                <w:szCs w:val="20"/>
-              </w:rPr>
-              <w:t xml:space="preserve"> </w:t>
-            </w:r>
-            <w:r>
-              <w:rPr>
-                <w:rFonts w:ascii="Times New Roman" w:hAnsi="Times New Roman" w:cs="Times New Roman"/>
-                <w:sz w:val="20"/>
-                <w:szCs w:val="20"/>
-              </w:rPr>
-              <w:t>девелопмент</w:t>
-            </w:r>
-            <w:r>
-              <w:rPr>
-                <w:rFonts w:ascii="Times New Roman" w:hAnsi="Times New Roman" w:cs="Times New Roman"/>
-                <w:sz w:val="20"/>
-                <w:szCs w:val="20"/>
-              </w:rPr>
-              <w:t>” ХХК-</w:t>
+              <w:t>“Ап проперти девелопмент” ХХК-</w:t>
             </w:r>
             <w:r>
               <w:rPr>
@@ -1194,16 +937,7 @@
                 <w:szCs w:val="20"/>
                 <w:lang w:val="mn-MN"/>
               </w:rPr>
-              <w:t xml:space="preserve" w:space="preserve"> болон Агент {{agent}}</w:t>
-            </w:r>
-            <w:r>
-              <w:rPr>
-                <w:rFonts w:ascii="Times New Roman" w:hAnsi="Times New Roman" w:cs="Times New Roman"/>
-                <w:sz w:val="20"/>
-                <w:szCs w:val="20"/>
-                <w:lang w:val="mn-MN"/>
-              </w:rPr>
-              <w:t/>
+              <w:t xml:space="preserve"> болон Агент {{agent}}</w:t>
             </w:r>
             <w:r>
               <w:rPr>
@@ -1282,7 +1016,7 @@
                 <w:sz w:val="20"/>
                 <w:szCs w:val="20"/>
               </w:rPr>
-              <w:t xml:space="preserve" w:space="preserve"> </w:t>
+              <w:t xml:space="preserve"> </w:t>
             </w:r>
             <w:r>
               <w:rPr>
@@ -1318,7 +1052,7 @@
                 <w:szCs w:val="20"/>
                 <w:lang w:val="mn-MN"/>
               </w:rPr>
-              <w:t>РД</w:t>
+              <w:t>РД: {{register}}</w:t>
             </w:r>
             <w:r>
               <w:rPr>
@@ -1327,16 +1061,7 @@
                 <w:szCs w:val="20"/>
                 <w:lang w:val="mn-MN"/>
               </w:rPr>
-              <w:t w:space="preserve">: {{register}}</w:t>
-            </w:r>
-            <w:r>
-              <w:rPr>
-                <w:rFonts w:ascii="Times New Roman" w:hAnsi="Times New Roman" w:cs="Times New Roman"/>
-                <w:sz w:val="20"/>
-                <w:szCs w:val="20"/>
-                <w:lang w:val="mn-MN"/>
-              </w:rPr>
-              <w:t xml:space="preserve" w:space="preserve"> </w:t>
+              <w:t xml:space="preserve"> </w:t>
             </w:r>
             <w:r>
               <w:rPr>
@@ -1421,135 +1146,7 @@
                 <w:sz w:val="20"/>
                 <w:szCs w:val="20"/>
               </w:rPr>
-              <w:t>(</w:t>
-            </w:r>
-            <w:r>
-              <w:rPr>
-                <w:rFonts w:ascii="Times New Roman" w:hAnsi="Times New Roman" w:cs="Times New Roman"/>
-                <w:sz w:val="20"/>
-                <w:szCs w:val="20"/>
-              </w:rPr>
-              <w:t>Зуучлуулагч</w:t>
-            </w:r>
-            <w:r>
-              <w:rPr>
-                <w:rFonts w:ascii="Times New Roman" w:hAnsi="Times New Roman" w:cs="Times New Roman"/>
-                <w:sz w:val="20"/>
-                <w:szCs w:val="20"/>
-              </w:rPr>
-              <w:t xml:space="preserve"> </w:t>
-            </w:r>
-            <w:r>
-              <w:rPr>
-                <w:rFonts w:ascii="Times New Roman" w:hAnsi="Times New Roman" w:cs="Times New Roman"/>
-                <w:sz w:val="20"/>
-                <w:szCs w:val="20"/>
-              </w:rPr>
-              <w:t>болон</w:t>
-            </w:r>
-            <w:r>
-              <w:rPr>
-                <w:rFonts w:ascii="Times New Roman" w:hAnsi="Times New Roman" w:cs="Times New Roman"/>
-                <w:sz w:val="20"/>
-                <w:szCs w:val="20"/>
-              </w:rPr>
-              <w:t xml:space="preserve"> </w:t>
-            </w:r>
-            <w:r>
-              <w:rPr>
-                <w:rFonts w:ascii="Times New Roman" w:hAnsi="Times New Roman" w:cs="Times New Roman"/>
-                <w:sz w:val="20"/>
-                <w:szCs w:val="20"/>
-              </w:rPr>
-              <w:t>зуучлагч</w:t>
-            </w:r>
-            <w:r>
-              <w:rPr>
-                <w:rFonts w:ascii="Times New Roman" w:hAnsi="Times New Roman" w:cs="Times New Roman"/>
-                <w:sz w:val="20"/>
-                <w:szCs w:val="20"/>
-              </w:rPr>
-              <w:t xml:space="preserve"> </w:t>
-            </w:r>
-            <w:r>
-              <w:rPr>
-                <w:rFonts w:ascii="Times New Roman" w:hAnsi="Times New Roman" w:cs="Times New Roman"/>
-                <w:sz w:val="20"/>
-                <w:szCs w:val="20"/>
-              </w:rPr>
-              <w:t>нарыг</w:t>
-            </w:r>
-            <w:r>
-              <w:rPr>
-                <w:rFonts w:ascii="Times New Roman" w:hAnsi="Times New Roman" w:cs="Times New Roman"/>
-                <w:sz w:val="20"/>
-                <w:szCs w:val="20"/>
-              </w:rPr>
-              <w:t xml:space="preserve"> </w:t>
-            </w:r>
-            <w:r>
-              <w:rPr>
-                <w:rFonts w:ascii="Times New Roman" w:hAnsi="Times New Roman" w:cs="Times New Roman"/>
-                <w:sz w:val="20"/>
-                <w:szCs w:val="20"/>
-              </w:rPr>
-              <w:t>хамтад</w:t>
-            </w:r>
-            <w:r>
-              <w:rPr>
-                <w:rFonts w:ascii="Times New Roman" w:hAnsi="Times New Roman" w:cs="Times New Roman"/>
-                <w:sz w:val="20"/>
-                <w:szCs w:val="20"/>
-              </w:rPr>
-              <w:t xml:space="preserve"> </w:t>
-            </w:r>
-            <w:r>
-              <w:rPr>
-                <w:rFonts w:ascii="Times New Roman" w:hAnsi="Times New Roman" w:cs="Times New Roman"/>
-                <w:sz w:val="20"/>
-                <w:szCs w:val="20"/>
-              </w:rPr>
-              <w:t>нь</w:t>
-            </w:r>
-            <w:r>
-              <w:rPr>
-                <w:rFonts w:ascii="Times New Roman" w:hAnsi="Times New Roman" w:cs="Times New Roman"/>
-                <w:sz w:val="20"/>
-                <w:szCs w:val="20"/>
-              </w:rPr>
-              <w:t xml:space="preserve"> “</w:t>
-            </w:r>
-            <w:r>
-              <w:rPr>
-                <w:rFonts w:ascii="Times New Roman" w:hAnsi="Times New Roman" w:cs="Times New Roman"/>
-                <w:sz w:val="20"/>
-                <w:szCs w:val="20"/>
-              </w:rPr>
-              <w:t>Талууд</w:t>
-            </w:r>
-            <w:r>
-              <w:rPr>
-                <w:rFonts w:ascii="Times New Roman" w:hAnsi="Times New Roman" w:cs="Times New Roman"/>
-                <w:sz w:val="20"/>
-                <w:szCs w:val="20"/>
-              </w:rPr>
-              <w:t xml:space="preserve">” </w:t>
-            </w:r>
-            <w:r>
-              <w:rPr>
-                <w:rFonts w:ascii="Times New Roman" w:hAnsi="Times New Roman" w:cs="Times New Roman"/>
-                <w:sz w:val="20"/>
-                <w:szCs w:val="20"/>
-              </w:rPr>
-              <w:t>гэнэ</w:t>
-            </w:r>
-            <w:r>
-              <w:rPr>
-                <w:rFonts w:ascii="Times New Roman" w:hAnsi="Times New Roman" w:cs="Times New Roman"/>
-                <w:sz w:val="20"/>
-                <w:szCs w:val="20"/>
-              </w:rPr>
-              <w:t xml:space="preserve">) </w:t>
+              <w:t xml:space="preserve">(Зуучлуулагч болон зуучлагч нарыг хамтад нь “Талууд” гэнэ) </w:t>
             </w:r>
             <w:r>
               <w:rPr>
@@ -1676,23 +1273,7 @@
                 <w:sz w:val="20"/>
                 <w:szCs w:val="20"/>
               </w:rPr>
-              <w:t>Талбайн</w:t>
-            </w:r>
-            <w:r>
-              <w:rPr>
-                <w:rFonts w:ascii="Times New Roman" w:hAnsi="Times New Roman" w:cs="Times New Roman"/>
-                <w:sz w:val="20"/>
-                <w:szCs w:val="20"/>
-              </w:rPr>
-              <w:t xml:space="preserve"> </w:t>
-            </w:r>
-            <w:r>
-              <w:rPr>
-                <w:rFonts w:ascii="Times New Roman" w:hAnsi="Times New Roman" w:cs="Times New Roman"/>
-                <w:sz w:val="20"/>
-                <w:szCs w:val="20"/>
-              </w:rPr>
-              <w:t>зориулалт</w:t>
+              <w:t>Талбайн зориулалт</w:t>
             </w:r>
           </w:p>
         </w:tc>
@@ -1724,16 +1305,6 @@
                 <w:szCs w:val="22"/>
               </w:rPr>
               <w:t>{{cert}}</w:t>
-            </w:r>
-            <w:r>
-              <w:rPr>
-                <w:rFonts w:ascii="Times New Roman" w:hAnsi="Times New Roman" w:cs="Times New Roman"/>
-                <w:bCs/>
-                <w:color w:val="000000"/>
-                <w:sz w:val="22"/>
-                <w:szCs w:val="22"/>
-              </w:rPr>
-              <w:t/>
             </w:r>
           </w:p>
         </w:tc>
@@ -1883,23 +1454,7 @@
                 <w:sz w:val="20"/>
                 <w:szCs w:val="20"/>
               </w:rPr>
-              <w:t>Өрөөний</w:t>
-            </w:r>
-            <w:r>
-              <w:rPr>
-                <w:rFonts w:ascii="Times New Roman" w:hAnsi="Times New Roman" w:cs="Times New Roman"/>
-                <w:sz w:val="20"/>
-                <w:szCs w:val="20"/>
-              </w:rPr>
-              <w:t xml:space="preserve"> </w:t>
-            </w:r>
-            <w:r>
-              <w:rPr>
-                <w:rFonts w:ascii="Times New Roman" w:hAnsi="Times New Roman" w:cs="Times New Roman"/>
-                <w:sz w:val="20"/>
-                <w:szCs w:val="20"/>
-              </w:rPr>
-              <w:t>тоо</w:t>
+              <w:t>Өрөөний тоо</w:t>
             </w:r>
           </w:p>
         </w:tc>
@@ -1923,23 +1478,7 @@
                 <w:sz w:val="20"/>
                 <w:szCs w:val="20"/>
               </w:rPr>
-              <w:t>Талбайн</w:t>
-            </w:r>
-            <w:r>
-              <w:rPr>
-                <w:rFonts w:ascii="Times New Roman" w:hAnsi="Times New Roman" w:cs="Times New Roman"/>
-                <w:sz w:val="20"/>
-                <w:szCs w:val="20"/>
-              </w:rPr>
-              <w:t xml:space="preserve"> </w:t>
-            </w:r>
-            <w:r>
-              <w:rPr>
-                <w:rFonts w:ascii="Times New Roman" w:hAnsi="Times New Roman" w:cs="Times New Roman"/>
-                <w:sz w:val="20"/>
-                <w:szCs w:val="20"/>
-              </w:rPr>
-              <w:t>хэмжээ</w:t>
+              <w:t>Талбайн хэмжээ</w:t>
             </w:r>
           </w:p>
         </w:tc>
@@ -1988,7 +1527,7 @@
                 <w:sz w:val="20"/>
                 <w:szCs w:val="20"/>
               </w:rPr>
-              <w:t xml:space="preserve" w:space="preserve"> </w:t>
+              <w:t xml:space="preserve"> </w:t>
             </w:r>
           </w:p>
         </w:tc>
@@ -2036,7 +1575,7 @@
                 <w:sz w:val="20"/>
                 <w:szCs w:val="20"/>
               </w:rPr>
-              <w:t xml:space="preserve" w:space="preserve"> </w:t>
+              <w:t xml:space="preserve"> </w:t>
             </w:r>
           </w:p>
         </w:tc>
@@ -2068,7 +1607,7 @@
                 <w:sz w:val="20"/>
                 <w:szCs w:val="20"/>
               </w:rPr>
-              <w:t xml:space="preserve" w:space="preserve"> </w:t>
+              <w:t xml:space="preserve"> </w:t>
             </w:r>
           </w:p>
         </w:tc>
@@ -2098,47 +1637,7 @@
                 <w:sz w:val="20"/>
                 <w:szCs w:val="20"/>
               </w:rPr>
-              <w:t>Энэхүү</w:t>
-            </w:r>
-            <w:r>
-              <w:rPr>
-                <w:rFonts w:ascii="Times New Roman" w:hAnsi="Times New Roman" w:cs="Times New Roman"/>
-                <w:sz w:val="20"/>
-                <w:szCs w:val="20"/>
-              </w:rPr>
-              <w:t xml:space="preserve"> </w:t>
-            </w:r>
-            <w:r>
-              <w:rPr>
-                <w:rFonts w:ascii="Times New Roman" w:hAnsi="Times New Roman" w:cs="Times New Roman"/>
-                <w:sz w:val="20"/>
-                <w:szCs w:val="20"/>
-              </w:rPr>
-              <w:t>гэрээний</w:t>
-            </w:r>
-            <w:r>
-              <w:rPr>
-                <w:rFonts w:ascii="Times New Roman" w:hAnsi="Times New Roman" w:cs="Times New Roman"/>
-                <w:sz w:val="20"/>
-                <w:szCs w:val="20"/>
-              </w:rPr>
-              <w:t xml:space="preserve"> </w:t>
-            </w:r>
-            <w:r>
-              <w:rPr>
-                <w:rFonts w:ascii="Times New Roman" w:hAnsi="Times New Roman" w:cs="Times New Roman"/>
-                <w:sz w:val="20"/>
-                <w:szCs w:val="20"/>
-              </w:rPr>
-              <w:t>хугацаа</w:t>
-            </w:r>
-            <w:r>
-              <w:rPr>
-                <w:rFonts w:ascii="Times New Roman" w:hAnsi="Times New Roman" w:cs="Times New Roman"/>
-                <w:sz w:val="20"/>
-                <w:szCs w:val="20"/>
-              </w:rPr>
-              <w:t xml:space="preserve"> (</w:t>
+              <w:t>Энэхүү гэрээний хугацаа (</w:t>
             </w:r>
             <w:r>
               <w:rPr>
@@ -2178,31 +1677,7 @@
                 <w:sz w:val="20"/>
                 <w:szCs w:val="20"/>
               </w:rPr>
-              <w:t>Өмчлөгчийн</w:t>
-            </w:r>
-            <w:r>
-              <w:rPr>
-                <w:rFonts w:ascii="Times New Roman" w:hAnsi="Times New Roman" w:cs="Times New Roman"/>
-                <w:sz w:val="20"/>
-                <w:szCs w:val="20"/>
-              </w:rPr>
-              <w:t xml:space="preserve"> </w:t>
-            </w:r>
-            <w:r>
-              <w:rPr>
-                <w:rFonts w:ascii="Times New Roman" w:hAnsi="Times New Roman" w:cs="Times New Roman"/>
-                <w:sz w:val="20"/>
-                <w:szCs w:val="20"/>
-              </w:rPr>
-              <w:t>тоо</w:t>
-            </w:r>
-            <w:r>
-              <w:rPr>
-                <w:rFonts w:ascii="Times New Roman" w:hAnsi="Times New Roman" w:cs="Times New Roman"/>
-                <w:sz w:val="20"/>
-                <w:szCs w:val="20"/>
-              </w:rPr>
-              <w:t xml:space="preserve">: </w:t>
+              <w:t xml:space="preserve">Өмчлөгчийн тоо: </w:t>
             </w:r>
           </w:p>
         </w:tc>
@@ -2227,63 +1702,7 @@
                 <w:sz w:val="20"/>
                 <w:szCs w:val="20"/>
               </w:rPr>
-              <w:t>Төлөөлж</w:t>
-            </w:r>
-            <w:r>
-              <w:rPr>
-                <w:rFonts w:ascii="Times New Roman" w:hAnsi="Times New Roman" w:cs="Times New Roman"/>
-                <w:sz w:val="20"/>
-                <w:szCs w:val="20"/>
-              </w:rPr>
-              <w:t xml:space="preserve"> </w:t>
-            </w:r>
-            <w:r>
-              <w:rPr>
-                <w:rFonts w:ascii="Times New Roman" w:hAnsi="Times New Roman" w:cs="Times New Roman"/>
-                <w:sz w:val="20"/>
-                <w:szCs w:val="20"/>
-              </w:rPr>
-              <w:t>гэрээ</w:t>
-            </w:r>
-            <w:r>
-              <w:rPr>
-                <w:rFonts w:ascii="Times New Roman" w:hAnsi="Times New Roman" w:cs="Times New Roman"/>
-                <w:sz w:val="20"/>
-                <w:szCs w:val="20"/>
-              </w:rPr>
-              <w:t xml:space="preserve"> </w:t>
-            </w:r>
-            <w:r>
-              <w:rPr>
-                <w:rFonts w:ascii="Times New Roman" w:hAnsi="Times New Roman" w:cs="Times New Roman"/>
-                <w:sz w:val="20"/>
-                <w:szCs w:val="20"/>
-              </w:rPr>
-              <w:t>хийсэн</w:t>
-            </w:r>
-            <w:r>
-              <w:rPr>
-                <w:rFonts w:ascii="Times New Roman" w:hAnsi="Times New Roman" w:cs="Times New Roman"/>
-                <w:sz w:val="20"/>
-                <w:szCs w:val="20"/>
-              </w:rPr>
-              <w:t xml:space="preserve"> </w:t>
-            </w:r>
-            <w:r>
-              <w:rPr>
-                <w:rFonts w:ascii="Times New Roman" w:hAnsi="Times New Roman" w:cs="Times New Roman"/>
-                <w:sz w:val="20"/>
-                <w:szCs w:val="20"/>
-              </w:rPr>
-              <w:t>өмчлөгч</w:t>
-            </w:r>
-            <w:r>
-              <w:rPr>
-                <w:rFonts w:ascii="Times New Roman" w:hAnsi="Times New Roman" w:cs="Times New Roman"/>
-                <w:sz w:val="20"/>
-                <w:szCs w:val="20"/>
-              </w:rPr>
-              <w:t xml:space="preserve">/ </w:t>
+              <w:t xml:space="preserve">Төлөөлж гэрээ хийсэн өмчлөгч/ </w:t>
             </w:r>
             <w:r>
               <w:rPr>
@@ -2329,23 +1748,7 @@
                 <w:sz w:val="20"/>
                 <w:szCs w:val="20"/>
               </w:rPr>
-              <w:t>Эхлэх</w:t>
-            </w:r>
-            <w:r>
-              <w:rPr>
-                <w:rFonts w:ascii="Times New Roman" w:hAnsi="Times New Roman" w:cs="Times New Roman"/>
-                <w:sz w:val="20"/>
-                <w:szCs w:val="20"/>
-              </w:rPr>
-              <w:t xml:space="preserve"> </w:t>
-            </w:r>
-            <w:r>
-              <w:rPr>
-                <w:rFonts w:ascii="Times New Roman" w:hAnsi="Times New Roman" w:cs="Times New Roman"/>
-                <w:sz w:val="20"/>
-                <w:szCs w:val="20"/>
-              </w:rPr>
-              <w:t>өдөр</w:t>
+              <w:t>Эхлэх өдөр</w:t>
             </w:r>
           </w:p>
         </w:tc>
@@ -2369,15 +1772,7 @@
                 <w:sz w:val="20"/>
                 <w:szCs w:val="20"/>
               </w:rPr>
-              <w:t>Дуусгавар</w:t>
-            </w:r>
-            <w:r>
-              <w:rPr>
-                <w:rFonts w:ascii="Times New Roman" w:hAnsi="Times New Roman" w:cs="Times New Roman"/>
-                <w:sz w:val="20"/>
-                <w:szCs w:val="20"/>
-              </w:rPr>
-              <w:t xml:space="preserve"> болох өдөр</w:t>
+              <w:t>Дуусгавар болох өдөр</w:t>
             </w:r>
           </w:p>
         </w:tc>
@@ -2521,23 +1916,7 @@
                 <w:sz w:val="20"/>
                 <w:szCs w:val="20"/>
               </w:rPr>
-              <w:t>Хуулийн</w:t>
-            </w:r>
-            <w:r>
-              <w:rPr>
-                <w:rFonts w:ascii="Times New Roman" w:hAnsi="Times New Roman" w:cs="Times New Roman"/>
-                <w:sz w:val="20"/>
-                <w:szCs w:val="20"/>
-              </w:rPr>
-              <w:t xml:space="preserve"> </w:t>
-            </w:r>
-            <w:r>
-              <w:rPr>
-                <w:rFonts w:ascii="Times New Roman" w:hAnsi="Times New Roman" w:cs="Times New Roman"/>
-                <w:sz w:val="20"/>
-                <w:szCs w:val="20"/>
-              </w:rPr>
-              <w:t>этгээд</w:t>
+              <w:t>Хуулийн этгээд</w:t>
             </w:r>
           </w:p>
           <w:p>
@@ -2604,15 +1983,7 @@
                 <w:sz w:val="20"/>
                 <w:szCs w:val="20"/>
               </w:rPr>
-              <w:t/>
-            </w:r>
-            <w:r>
-              <w:rPr>
-                <w:rFonts w:ascii="Times New Roman" w:hAnsi="Times New Roman" w:cs="Times New Roman"/>
-                <w:sz w:val="20"/>
-                <w:szCs w:val="20"/>
-              </w:rPr>
-              <w:t xml:space="preserve" w:space="preserve"> </w:t>
+              <w:t xml:space="preserve"> </w:t>
             </w:r>
             <w:r>
               <w:rPr>
@@ -2644,31 +2015,7 @@
                 <w:sz w:val="20"/>
                 <w:szCs w:val="20"/>
               </w:rPr>
-              <w:t>{{startDate}}</w:t>
-            </w:r>
-            <w:r>
-              <w:rPr>
-                <w:rFonts w:ascii="Times New Roman" w:hAnsi="Times New Roman" w:cs="Times New Roman"/>
-                <w:sz w:val="20"/>
-                <w:szCs w:val="20"/>
-              </w:rPr>
-              <w:t/>
-            </w:r>
-            <w:r>
-              <w:rPr>
-                <w:rFonts w:ascii="Times New Roman" w:hAnsi="Times New Roman" w:cs="Times New Roman"/>
-                <w:sz w:val="20"/>
-                <w:szCs w:val="20"/>
-              </w:rPr>
-              <w:t xml:space="preserve" w:space="preserve"> </w:t>
-            </w:r>
-            <w:r>
-              <w:rPr>
-                <w:rFonts w:ascii="Times New Roman" w:hAnsi="Times New Roman" w:cs="Times New Roman"/>
-                <w:sz w:val="20"/>
-                <w:szCs w:val="20"/>
-              </w:rPr>
-              <w:t xml:space="preserve"> </w:t>
+              <w:t>{{endDate}}</w:t>
             </w:r>
           </w:p>
         </w:tc>
@@ -2831,47 +2178,7 @@
                 <w:sz w:val="20"/>
                 <w:szCs w:val="20"/>
               </w:rPr>
-              <w:t>Нотолсон</w:t>
-            </w:r>
-            <w:r>
-              <w:rPr>
-                <w:rFonts w:ascii="Times New Roman" w:hAnsi="Times New Roman" w:cs="Times New Roman"/>
-                <w:sz w:val="20"/>
-                <w:szCs w:val="20"/>
-              </w:rPr>
-              <w:t xml:space="preserve"> </w:t>
-            </w:r>
-            <w:r>
-              <w:rPr>
-                <w:rFonts w:ascii="Times New Roman" w:hAnsi="Times New Roman" w:cs="Times New Roman"/>
-                <w:sz w:val="20"/>
-                <w:szCs w:val="20"/>
-              </w:rPr>
-              <w:t>гарын</w:t>
-            </w:r>
-            <w:r>
-              <w:rPr>
-                <w:rFonts w:ascii="Times New Roman" w:hAnsi="Times New Roman" w:cs="Times New Roman"/>
-                <w:sz w:val="20"/>
-                <w:szCs w:val="20"/>
-              </w:rPr>
-              <w:t xml:space="preserve"> </w:t>
-            </w:r>
-            <w:r>
-              <w:rPr>
-                <w:rFonts w:ascii="Times New Roman" w:hAnsi="Times New Roman" w:cs="Times New Roman"/>
-                <w:sz w:val="20"/>
-                <w:szCs w:val="20"/>
-              </w:rPr>
-              <w:t>үсэг</w:t>
-            </w:r>
-            <w:r>
-              <w:rPr>
-                <w:rFonts w:ascii="Times New Roman" w:hAnsi="Times New Roman" w:cs="Times New Roman"/>
-                <w:sz w:val="20"/>
-                <w:szCs w:val="20"/>
-              </w:rPr>
-              <w:t>:</w:t>
+              <w:t>Нотолсон гарын үсэг:</w:t>
             </w:r>
           </w:p>
           <w:p>
@@ -2944,47 +2251,7 @@
                 <w:sz w:val="20"/>
                 <w:szCs w:val="20"/>
               </w:rPr>
-              <w:t>Нотолсон</w:t>
-            </w:r>
-            <w:r>
-              <w:rPr>
-                <w:rFonts w:ascii="Times New Roman" w:hAnsi="Times New Roman" w:cs="Times New Roman"/>
-                <w:sz w:val="20"/>
-                <w:szCs w:val="20"/>
-              </w:rPr>
-              <w:t xml:space="preserve"> </w:t>
-            </w:r>
-            <w:r>
-              <w:rPr>
-                <w:rFonts w:ascii="Times New Roman" w:hAnsi="Times New Roman" w:cs="Times New Roman"/>
-                <w:sz w:val="20"/>
-                <w:szCs w:val="20"/>
-              </w:rPr>
-              <w:t>гарын</w:t>
-            </w:r>
-            <w:r>
-              <w:rPr>
-                <w:rFonts w:ascii="Times New Roman" w:hAnsi="Times New Roman" w:cs="Times New Roman"/>
-                <w:sz w:val="20"/>
-                <w:szCs w:val="20"/>
-              </w:rPr>
-              <w:t xml:space="preserve"> </w:t>
-            </w:r>
-            <w:r>
-              <w:rPr>
-                <w:rFonts w:ascii="Times New Roman" w:hAnsi="Times New Roman" w:cs="Times New Roman"/>
-                <w:sz w:val="20"/>
-                <w:szCs w:val="20"/>
-              </w:rPr>
-              <w:t>үсэг</w:t>
-            </w:r>
-            <w:r>
-              <w:rPr>
-                <w:rFonts w:ascii="Times New Roman" w:hAnsi="Times New Roman" w:cs="Times New Roman"/>
-                <w:sz w:val="20"/>
-                <w:szCs w:val="20"/>
-              </w:rPr>
-              <w:t>:</w:t>
+              <w:t>Нотолсон гарын үсэг:</w:t>
             </w:r>
           </w:p>
           <w:p>
@@ -3057,47 +2324,7 @@
                 <w:sz w:val="20"/>
                 <w:szCs w:val="20"/>
               </w:rPr>
-              <w:t>Нотолсон</w:t>
-            </w:r>
-            <w:r>
-              <w:rPr>
-                <w:rFonts w:ascii="Times New Roman" w:hAnsi="Times New Roman" w:cs="Times New Roman"/>
-                <w:sz w:val="20"/>
-                <w:szCs w:val="20"/>
-              </w:rPr>
-              <w:t xml:space="preserve"> </w:t>
-            </w:r>
-            <w:r>
-              <w:rPr>
-                <w:rFonts w:ascii="Times New Roman" w:hAnsi="Times New Roman" w:cs="Times New Roman"/>
-                <w:sz w:val="20"/>
-                <w:szCs w:val="20"/>
-              </w:rPr>
-              <w:t>гарын</w:t>
-            </w:r>
-            <w:r>
-              <w:rPr>
-                <w:rFonts w:ascii="Times New Roman" w:hAnsi="Times New Roman" w:cs="Times New Roman"/>
-                <w:sz w:val="20"/>
-                <w:szCs w:val="20"/>
-              </w:rPr>
-              <w:t xml:space="preserve"> </w:t>
-            </w:r>
-            <w:r>
-              <w:rPr>
-                <w:rFonts w:ascii="Times New Roman" w:hAnsi="Times New Roman" w:cs="Times New Roman"/>
-                <w:sz w:val="20"/>
-                <w:szCs w:val="20"/>
-              </w:rPr>
-              <w:t>үсэг</w:t>
-            </w:r>
-            <w:r>
-              <w:rPr>
-                <w:rFonts w:ascii="Times New Roman" w:hAnsi="Times New Roman" w:cs="Times New Roman"/>
-                <w:sz w:val="20"/>
-                <w:szCs w:val="20"/>
-              </w:rPr>
-              <w:t>:</w:t>
+              <w:t>Нотолсон гарын үсэг:</w:t>
             </w:r>
           </w:p>
           <w:p>
@@ -3145,119 +2372,7 @@
                 <w:sz w:val="20"/>
                 <w:szCs w:val="20"/>
               </w:rPr>
-              <w:t>Мэдээллийг</w:t>
-            </w:r>
-            <w:r>
-              <w:rPr>
-                <w:rFonts w:ascii="Times New Roman" w:hAnsi="Times New Roman" w:cs="Times New Roman"/>
-                <w:sz w:val="20"/>
-                <w:szCs w:val="20"/>
-              </w:rPr>
-              <w:t xml:space="preserve"> </w:t>
-            </w:r>
-            <w:r>
-              <w:rPr>
-                <w:rFonts w:ascii="Times New Roman" w:hAnsi="Times New Roman" w:cs="Times New Roman"/>
-                <w:sz w:val="20"/>
-                <w:szCs w:val="20"/>
-              </w:rPr>
-              <w:t>цааш</w:t>
-            </w:r>
-            <w:r>
-              <w:rPr>
-                <w:rFonts w:ascii="Times New Roman" w:hAnsi="Times New Roman" w:cs="Times New Roman"/>
-                <w:sz w:val="20"/>
-                <w:szCs w:val="20"/>
-              </w:rPr>
-              <w:t xml:space="preserve"> </w:t>
-            </w:r>
-            <w:r>
-              <w:rPr>
-                <w:rFonts w:ascii="Times New Roman" w:hAnsi="Times New Roman" w:cs="Times New Roman"/>
-                <w:sz w:val="20"/>
-                <w:szCs w:val="20"/>
-              </w:rPr>
-              <w:t>төрийн</w:t>
-            </w:r>
-            <w:r>
-              <w:rPr>
-                <w:rFonts w:ascii="Times New Roman" w:hAnsi="Times New Roman" w:cs="Times New Roman"/>
-                <w:sz w:val="20"/>
-                <w:szCs w:val="20"/>
-              </w:rPr>
-              <w:t xml:space="preserve"> </w:t>
-            </w:r>
-            <w:r>
-              <w:rPr>
-                <w:rFonts w:ascii="Times New Roman" w:hAnsi="Times New Roman" w:cs="Times New Roman"/>
-                <w:sz w:val="20"/>
-                <w:szCs w:val="20"/>
-              </w:rPr>
-              <w:t>захиргааны</w:t>
-            </w:r>
-            <w:r>
-              <w:rPr>
-                <w:rFonts w:ascii="Times New Roman" w:hAnsi="Times New Roman" w:cs="Times New Roman"/>
-                <w:sz w:val="20"/>
-                <w:szCs w:val="20"/>
-              </w:rPr>
-              <w:t xml:space="preserve"> </w:t>
-            </w:r>
-            <w:r>
-              <w:rPr>
-                <w:rFonts w:ascii="Times New Roman" w:hAnsi="Times New Roman" w:cs="Times New Roman"/>
-                <w:sz w:val="20"/>
-                <w:szCs w:val="20"/>
-              </w:rPr>
-              <w:t>байгууллагын</w:t>
-            </w:r>
-            <w:r>
-              <w:rPr>
-                <w:rFonts w:ascii="Times New Roman" w:hAnsi="Times New Roman" w:cs="Times New Roman"/>
-                <w:sz w:val="20"/>
-                <w:szCs w:val="20"/>
-              </w:rPr>
-              <w:t xml:space="preserve"> </w:t>
-            </w:r>
-            <w:r>
-              <w:rPr>
-                <w:rFonts w:ascii="Times New Roman" w:hAnsi="Times New Roman" w:cs="Times New Roman"/>
-                <w:sz w:val="20"/>
-                <w:szCs w:val="20"/>
-              </w:rPr>
-              <w:t>хэрэгцээнд</w:t>
-            </w:r>
-            <w:r>
-              <w:rPr>
-                <w:rFonts w:ascii="Times New Roman" w:hAnsi="Times New Roman" w:cs="Times New Roman"/>
-                <w:sz w:val="20"/>
-                <w:szCs w:val="20"/>
-              </w:rPr>
-              <w:t xml:space="preserve"> </w:t>
-            </w:r>
-            <w:r>
-              <w:rPr>
-                <w:rFonts w:ascii="Times New Roman" w:hAnsi="Times New Roman" w:cs="Times New Roman"/>
-                <w:sz w:val="20"/>
-                <w:szCs w:val="20"/>
-              </w:rPr>
-              <w:t>илгээхийг</w:t>
-            </w:r>
-            <w:r>
-              <w:rPr>
-                <w:rFonts w:ascii="Times New Roman" w:hAnsi="Times New Roman" w:cs="Times New Roman"/>
-                <w:sz w:val="20"/>
-                <w:szCs w:val="20"/>
-              </w:rPr>
-              <w:t xml:space="preserve"> </w:t>
-            </w:r>
-            <w:r>
-              <w:rPr>
-                <w:rFonts w:ascii="Times New Roman" w:hAnsi="Times New Roman" w:cs="Times New Roman"/>
-                <w:sz w:val="20"/>
-                <w:szCs w:val="20"/>
-              </w:rPr>
-              <w:t>зөвшөөрөх</w:t>
+              <w:t>Мэдээллийг цааш төрийн захиргааны байгууллагын хэрэгцээнд илгээхийг зөвшөөрөх</w:t>
             </w:r>
           </w:p>
         </w:tc>
@@ -3281,47 +2396,7 @@
                 <w:sz w:val="20"/>
                 <w:szCs w:val="20"/>
               </w:rPr>
-              <w:t>Нотолсон</w:t>
-            </w:r>
-            <w:r>
-              <w:rPr>
-                <w:rFonts w:ascii="Times New Roman" w:hAnsi="Times New Roman" w:cs="Times New Roman"/>
-                <w:sz w:val="20"/>
-                <w:szCs w:val="20"/>
-              </w:rPr>
-              <w:t xml:space="preserve"> </w:t>
-            </w:r>
-            <w:r>
-              <w:rPr>
-                <w:rFonts w:ascii="Times New Roman" w:hAnsi="Times New Roman" w:cs="Times New Roman"/>
-                <w:sz w:val="20"/>
-                <w:szCs w:val="20"/>
-              </w:rPr>
-              <w:t>гарын</w:t>
-            </w:r>
-            <w:r>
-              <w:rPr>
-                <w:rFonts w:ascii="Times New Roman" w:hAnsi="Times New Roman" w:cs="Times New Roman"/>
-                <w:sz w:val="20"/>
-                <w:szCs w:val="20"/>
-              </w:rPr>
-              <w:t xml:space="preserve"> </w:t>
-            </w:r>
-            <w:r>
-              <w:rPr>
-                <w:rFonts w:ascii="Times New Roman" w:hAnsi="Times New Roman" w:cs="Times New Roman"/>
-                <w:sz w:val="20"/>
-                <w:szCs w:val="20"/>
-              </w:rPr>
-              <w:t>үсэг</w:t>
-            </w:r>
-            <w:r>
-              <w:rPr>
-                <w:rFonts w:ascii="Times New Roman" w:hAnsi="Times New Roman" w:cs="Times New Roman"/>
-                <w:sz w:val="20"/>
-                <w:szCs w:val="20"/>
-              </w:rPr>
-              <w:t>:</w:t>
+              <w:t>Нотолсон гарын үсэг:</w:t>
             </w:r>
           </w:p>
           <w:p>
@@ -3427,31 +2502,7 @@
                 <w:sz w:val="20"/>
                 <w:szCs w:val="20"/>
               </w:rPr>
-              <w:t>Энэхүү</w:t>
-            </w:r>
-            <w:r>
-              <w:rPr>
-                <w:rFonts w:ascii="Times New Roman" w:hAnsi="Times New Roman" w:cs="Times New Roman"/>
-                <w:sz w:val="20"/>
-                <w:szCs w:val="20"/>
-              </w:rPr>
-              <w:t xml:space="preserve"> </w:t>
-            </w:r>
-            <w:r>
-              <w:rPr>
-                <w:rFonts w:ascii="Times New Roman" w:hAnsi="Times New Roman" w:cs="Times New Roman"/>
-                <w:sz w:val="20"/>
-                <w:szCs w:val="20"/>
-              </w:rPr>
-              <w:t>гэрээний</w:t>
-            </w:r>
-            <w:r>
-              <w:rPr>
-                <w:rFonts w:ascii="Times New Roman" w:hAnsi="Times New Roman" w:cs="Times New Roman"/>
-                <w:sz w:val="20"/>
-                <w:szCs w:val="20"/>
-              </w:rPr>
-              <w:t xml:space="preserve"> 4.1-</w:t>
+              <w:t>Энэхүү гэрээний 4.1-</w:t>
             </w:r>
             <w:r>
               <w:rPr>
@@ -3486,22 +2537,6 @@
                 <w:szCs w:val="20"/>
               </w:rPr>
               <w:t>{{commissionRate}}</w:t>
-            </w:r>
-            <w:r>
-              <w:rPr>
-                <w:rFonts w:ascii="Times New Roman" w:hAnsi="Times New Roman" w:cs="Times New Roman"/>
-                <w:sz w:val="20"/>
-                <w:szCs w:val="20"/>
-              </w:rPr>
-              <w:t/>
-            </w:r>
-            <w:r>
-              <w:rPr>
-                <w:rFonts w:ascii="Times New Roman" w:hAnsi="Times New Roman" w:cs="Times New Roman"/>
-                <w:sz w:val="20"/>
-                <w:szCs w:val="20"/>
-              </w:rPr>
-              <w:t/>
             </w:r>
           </w:p>
         </w:tc>
@@ -3531,31 +2566,7 @@
                 <w:sz w:val="20"/>
                 <w:szCs w:val="20"/>
               </w:rPr>
-              <w:t>Энэхүү</w:t>
-            </w:r>
-            <w:r>
-              <w:rPr>
-                <w:rFonts w:ascii="Times New Roman" w:hAnsi="Times New Roman" w:cs="Times New Roman"/>
-                <w:sz w:val="20"/>
-                <w:szCs w:val="20"/>
-              </w:rPr>
-              <w:t xml:space="preserve"> </w:t>
-            </w:r>
-            <w:r>
-              <w:rPr>
-                <w:rFonts w:ascii="Times New Roman" w:hAnsi="Times New Roman" w:cs="Times New Roman"/>
-                <w:sz w:val="20"/>
-                <w:szCs w:val="20"/>
-              </w:rPr>
-              <w:t>гэрээний</w:t>
-            </w:r>
-            <w:r>
-              <w:rPr>
-                <w:rFonts w:ascii="Times New Roman" w:hAnsi="Times New Roman" w:cs="Times New Roman"/>
-                <w:sz w:val="20"/>
-                <w:szCs w:val="20"/>
-              </w:rPr>
-              <w:t xml:space="preserve"> 4.1-</w:t>
+              <w:t>Энэхүү гэрээний 4.1-</w:t>
             </w:r>
             <w:r>
               <w:rPr>
@@ -3590,22 +2601,6 @@
                 <w:szCs w:val="20"/>
               </w:rPr>
               <w:t>{{commissionAmount}}</w:t>
-            </w:r>
-            <w:r>
-              <w:rPr>
-                <w:rFonts w:ascii="Times New Roman" w:hAnsi="Times New Roman" w:cs="Times New Roman"/>
-                <w:sz w:val="20"/>
-                <w:szCs w:val="20"/>
-              </w:rPr>
-              <w:t/>
-            </w:r>
-            <w:r>
-              <w:rPr>
-                <w:rFonts w:ascii="Times New Roman" w:hAnsi="Times New Roman" w:cs="Times New Roman"/>
-                <w:sz w:val="20"/>
-                <w:szCs w:val="20"/>
-              </w:rPr>
-              <w:t/>
             </w:r>
           </w:p>
         </w:tc>
@@ -3635,55 +2630,7 @@
                 <w:sz w:val="20"/>
                 <w:szCs w:val="20"/>
               </w:rPr>
-              <w:t>Зуучлалын</w:t>
-            </w:r>
-            <w:r>
-              <w:rPr>
-                <w:rFonts w:ascii="Times New Roman" w:hAnsi="Times New Roman" w:cs="Times New Roman"/>
-                <w:sz w:val="20"/>
-                <w:szCs w:val="20"/>
-              </w:rPr>
-              <w:t xml:space="preserve"> </w:t>
-            </w:r>
-            <w:r>
-              <w:rPr>
-                <w:rFonts w:ascii="Times New Roman" w:hAnsi="Times New Roman" w:cs="Times New Roman"/>
-                <w:sz w:val="20"/>
-                <w:szCs w:val="20"/>
-              </w:rPr>
-              <w:t>хөлс</w:t>
-            </w:r>
-            <w:r>
-              <w:rPr>
-                <w:rFonts w:ascii="Times New Roman" w:hAnsi="Times New Roman" w:cs="Times New Roman"/>
-                <w:sz w:val="20"/>
-                <w:szCs w:val="20"/>
-              </w:rPr>
-              <w:t xml:space="preserve"> </w:t>
-            </w:r>
-            <w:r>
-              <w:rPr>
-                <w:rFonts w:ascii="Times New Roman" w:hAnsi="Times New Roman" w:cs="Times New Roman"/>
-                <w:sz w:val="20"/>
-                <w:szCs w:val="20"/>
-              </w:rPr>
-              <w:t>үсгээр</w:t>
-            </w:r>
-            <w:r>
-              <w:rPr>
-                <w:rFonts w:ascii="Times New Roman" w:hAnsi="Times New Roman" w:cs="Times New Roman"/>
-                <w:sz w:val="20"/>
-                <w:szCs w:val="20"/>
-              </w:rPr>
-              <w:t>:…</w:t>
-            </w:r>
-            <w:r>
-              <w:rPr>
-                <w:rFonts w:ascii="Times New Roman" w:hAnsi="Times New Roman" w:cs="Times New Roman"/>
-                <w:sz w:val="20"/>
-                <w:szCs w:val="20"/>
-              </w:rPr>
-              <w:t>……………………………………………………………………………………………..</w:t>
+              <w:t>Зуучлалын хөлс үсгээр:………………………………………………………………………………………………..</w:t>
             </w:r>
           </w:p>
         </w:tc>
@@ -3936,34 +2883,25 @@
           <w:szCs w:val="20"/>
           <w:lang w:val="mn-MN"/>
         </w:rPr>
-        <w:t w:space="preserve">Энэхүү Гэрээ нь ({{duration}}</w:t>
-      </w:r>
-      <w:r>
-        <w:rPr>
-          <w:rFonts w:ascii="Times New Roman" w:hAnsi="Times New Roman" w:cs="Times New Roman"/>
-          <w:sz w:val="20"/>
-          <w:szCs w:val="20"/>
-          <w:lang w:val="mn-MN"/>
-        </w:rPr>
-        <w:t xml:space="preserve" w:space="preserve"> </w:t>
-      </w:r>
-      <w:r>
-        <w:rPr>
-          <w:rFonts w:ascii="Times New Roman" w:hAnsi="Times New Roman" w:cs="Times New Roman"/>
-          <w:sz w:val="20"/>
-          <w:szCs w:val="20"/>
-          <w:lang w:val="mn-MN"/>
-        </w:rPr>
-        <w:t w:space="preserve">) сарын хугацаатай байх бөгөөд {{startDate}}</w:t>
-      </w:r>
-      <w:r>
-        <w:rPr>
-          <w:rFonts w:ascii="Times New Roman" w:hAnsi="Times New Roman" w:cs="Times New Roman"/>
-          <w:sz w:val="20"/>
-          <w:szCs w:val="20"/>
-          <w:lang w:val="mn-MN"/>
-        </w:rPr>
-        <w:t/>
+        <w:t>Энэхүү Гэрээ нь ({{duration}}</w:t>
+      </w:r>
+      <w:r>
+        <w:rPr>
+          <w:rFonts w:ascii="Times New Roman" w:hAnsi="Times New Roman" w:cs="Times New Roman"/>
+          <w:sz w:val="20"/>
+          <w:szCs w:val="20"/>
+          <w:lang w:val="mn-MN"/>
+        </w:rPr>
+        <w:t xml:space="preserve"> </w:t>
+      </w:r>
+      <w:r>
+        <w:rPr>
+          <w:rFonts w:ascii="Times New Roman" w:hAnsi="Times New Roman" w:cs="Times New Roman"/>
+          <w:sz w:val="20"/>
+          <w:szCs w:val="20"/>
+          <w:lang w:val="mn-MN"/>
+        </w:rPr>
+        <w:t>) сарын хугацаатай байх бөгөөд {{startDate}}</w:t>
       </w:r>
       <w:r>
         <w:rPr>
@@ -4000,17 +2938,7 @@
           <w:szCs w:val="20"/>
           <w:lang w:val="mn-MN"/>
         </w:rPr>
-        <w:t xml:space="preserve">{{endDate}}  </w:t>
-      </w:r>
-      <w:r>
-        <w:rPr>
-          <w:rFonts w:ascii="Times New Roman" w:hAnsi="Times New Roman" w:cs="Times New Roman"/>
-          <w:b/>
-          <w:sz w:val="20"/>
-          <w:szCs w:val="20"/>
-          <w:lang w:val="mn-MN"/>
-        </w:rPr>
-        <w:t>-</w:t>
+        <w:t>{{endDate}}  -</w:t>
       </w:r>
       <w:r>
         <w:rPr>
@@ -8692,7 +7620,7 @@
           <w:b/>
           <w:lang w:val="mn-MN"/>
         </w:rPr>
-        <w:t xml:space="preserve" w:space="preserve"> </w:t>
+        <w:t xml:space="preserve"> </w:t>
       </w:r>
     </w:p>
     <w:bookmarkEnd w:id="8"/>
@@ -8778,7 +7706,7 @@
           <w:b/>
           <w:lang w:val="mn-MN"/>
         </w:rPr>
-        <w:t xml:space="preserve" w:space="preserve"> </w:t>
+        <w:t xml:space="preserve"> </w:t>
       </w:r>
       <w:bookmarkEnd w:id="9"/>
     </w:p>
@@ -8825,7 +7753,7 @@
           <w:b/>
           <w:lang w:val="mn-MN"/>
         </w:rPr>
-        <w:t xml:space="preserve" w:space="preserve"> </w:t>
+        <w:t xml:space="preserve"> </w:t>
       </w:r>
     </w:p>
     <w:p>
@@ -8877,7 +7805,7 @@
           <w:szCs w:val="19"/>
           <w:lang w:val="mn-MN"/>
         </w:rPr>
-        <w:t xml:space="preserve" w:space="preserve"> </w:t>
+        <w:t xml:space="preserve"> </w:t>
       </w:r>
     </w:p>
     <w:p>
@@ -8923,7 +7851,7 @@
           <w:b/>
           <w:lang w:val="mn-MN"/>
         </w:rPr>
-        <w:t xml:space="preserve" w:space="preserve"> </w:t>
+        <w:t xml:space="preserve"> </w:t>
       </w:r>
     </w:p>
     <w:p>
@@ -9046,7 +7974,7 @@
           <w:b/>
           <w:lang w:val="mn-MN"/>
         </w:rPr>
-        <w:t xml:space="preserve" w:space="preserve"> </w:t>
+        <w:t xml:space="preserve"> </w:t>
       </w:r>
     </w:p>
     <w:p>
@@ -9122,7 +8050,7 @@
           <w:b/>
           <w:lang w:val="mn-MN"/>
         </w:rPr>
-        <w:t xml:space="preserve" w:space="preserve"> </w:t>
+        <w:t xml:space="preserve"> </w:t>
       </w:r>
       <w:bookmarkEnd w:id="10"/>
     </w:p>
@@ -9355,14 +8283,7 @@
           <w:rFonts w:ascii="Times New Roman" w:hAnsi="Times New Roman" w:cs="Times New Roman"/>
           <w:bCs/>
         </w:rPr>
-        <w:t xml:space="preserve">J Tower 908 </w:t>
-      </w:r>
-      <w:r>
-        <w:rPr>
-          <w:rFonts w:ascii="Times New Roman" w:hAnsi="Times New Roman" w:cs="Times New Roman"/>
-          <w:bCs/>
-        </w:rPr>
-        <w:t>тоот</w:t>
+        <w:t>J Tower 908 тоот</w:t>
       </w:r>
     </w:p>
     <w:p>
@@ -12859,6 +11780,7 @@
   <w:style w:type="character" w:default="1" w:styleId="DefaultParagraphFont">
     <w:name w:val="Default Paragraph Font"/>
     <w:uiPriority w:val="1"/>
+    <w:semiHidden/>
     <w:unhideWhenUsed/>
   </w:style>
   <w:style w:type="table" w:default="1" w:styleId="TableNormal">

</xml_diff>